<commit_message>
Improved on the flexibility of config and parameters
</commit_message>
<xml_diff>
--- a/Mac-guide.docx
+++ b/Mac-guide.docx
@@ -257,7 +257,21 @@
           <w:sz w:val="28"/>
           <w:szCs w:val="28"/>
         </w:rPr>
-        <w:t>Installer den som et almindeligt program</w:t>
+        <w:t>Install</w:t>
+      </w:r>
+      <w:r>
+        <w:rPr>
+          <w:sz w:val="28"/>
+          <w:szCs w:val="28"/>
+        </w:rPr>
+        <w:t>é</w:t>
+      </w:r>
+      <w:r>
+        <w:rPr>
+          <w:sz w:val="28"/>
+          <w:szCs w:val="28"/>
+        </w:rPr>
+        <w:t>r den som et almindeligt program</w:t>
       </w:r>
       <w:r>
         <w:rPr>
@@ -316,7 +330,35 @@
           <w:sz w:val="28"/>
           <w:szCs w:val="28"/>
         </w:rPr>
-        <w:t>. Det åbner Spotlight søgevinduet, som ser cirka sådan ud:</w:t>
+        <w:t>. Det</w:t>
+      </w:r>
+      <w:r>
+        <w:rPr>
+          <w:sz w:val="28"/>
+          <w:szCs w:val="28"/>
+        </w:rPr>
+        <w:t>te</w:t>
+      </w:r>
+      <w:r>
+        <w:rPr>
+          <w:sz w:val="28"/>
+          <w:szCs w:val="28"/>
+        </w:rPr>
+        <w:t xml:space="preserve"> åbner Spotlight</w:t>
+      </w:r>
+      <w:r>
+        <w:rPr>
+          <w:sz w:val="28"/>
+          <w:szCs w:val="28"/>
+        </w:rPr>
+        <w:t>-</w:t>
+      </w:r>
+      <w:r>
+        <w:rPr>
+          <w:sz w:val="28"/>
+          <w:szCs w:val="28"/>
+        </w:rPr>
+        <w:t>søgevinduet, som ser cirka sådan ud:</w:t>
       </w:r>
       <w:r>
         <w:drawing>
@@ -740,7 +782,21 @@
           <w:sz w:val="28"/>
           <w:szCs w:val="28"/>
         </w:rPr>
-        <w:t xml:space="preserve">Dette henter de pakker programmet skal bruge. </w:t>
+        <w:t>Dette henter de pakker</w:t>
+      </w:r>
+      <w:r>
+        <w:rPr>
+          <w:sz w:val="28"/>
+          <w:szCs w:val="28"/>
+        </w:rPr>
+        <w:t>,</w:t>
+      </w:r>
+      <w:r>
+        <w:rPr>
+          <w:sz w:val="28"/>
+          <w:szCs w:val="28"/>
+        </w:rPr>
+        <w:t xml:space="preserve"> programmet skal bruge. </w:t>
       </w:r>
       <w:r>
         <w:rPr>
@@ -754,7 +810,21 @@
           <w:sz w:val="28"/>
           <w:szCs w:val="28"/>
         </w:rPr>
-        <w:t xml:space="preserve"> udskriver nu noget tekst om at den installerer nogle filer. Når installationen er færdig, begynder den nederste linje i </w:t>
+        <w:t xml:space="preserve"> udskriver nu noget tekst</w:t>
+      </w:r>
+      <w:r>
+        <w:rPr>
+          <w:sz w:val="28"/>
+          <w:szCs w:val="28"/>
+        </w:rPr>
+        <w:t>,</w:t>
+      </w:r>
+      <w:r>
+        <w:rPr>
+          <w:sz w:val="28"/>
+          <w:szCs w:val="28"/>
+        </w:rPr>
+        <w:t xml:space="preserve"> om at den installerer nogle filer. Når installationen er færdig, begynder den nederste linje i </w:t>
       </w:r>
       <w:r>
         <w:rPr>
@@ -1559,6 +1629,13 @@
           <w:sz w:val="28"/>
           <w:szCs w:val="28"/>
         </w:rPr>
+        <w:t>,</w:t>
+      </w:r>
+      <w:r>
+        <w:rPr>
+          <w:sz w:val="28"/>
+          <w:szCs w:val="28"/>
+        </w:rPr>
         <w:t xml:space="preserve"> </w:t>
       </w:r>
       <w:r>
@@ -1888,8 +1965,13 @@
       <w:pPr>
         <w:spacing w:line="360" w:lineRule="auto"/>
         <w:rPr>
-          <w:sz w:val="28"/>
-          <w:szCs w:val="28"/>
+          <w:rFonts w:ascii="Times New Roman" w:eastAsia="Times New Roman" w:hAnsi="Times New Roman" w:cs="Times New Roman"/>
+          <w:noProof w:val="0"/>
+          <w:kern w:val="0"/>
+          <w:sz w:val="24"/>
+          <w:szCs w:val="24"/>
+          <w:lang w:eastAsia="da-DK"/>
+          <w14:ligatures w14:val="none"/>
         </w:rPr>
       </w:pPr>
       <w:r>
@@ -2048,7 +2130,14 @@
           <w:sz w:val="28"/>
           <w:szCs w:val="28"/>
         </w:rPr>
-        <w:t>. For at åbne en fil i TextEdit</w:t>
+        <w:t xml:space="preserve">. </w:t>
+      </w:r>
+      <w:r>
+        <w:rPr>
+          <w:sz w:val="28"/>
+          <w:szCs w:val="28"/>
+        </w:rPr>
+        <w:t>Før du åbner en fil i TextEdit</w:t>
       </w:r>
       <w:r>
         <w:rPr>
@@ -2062,7 +2151,256 @@
           <w:sz w:val="28"/>
           <w:szCs w:val="28"/>
         </w:rPr>
-        <w:t xml:space="preserve"> gør følgende:</w:t>
+        <w:t xml:space="preserve"> skal du ændre </w:t>
+      </w:r>
+      <w:r>
+        <w:rPr>
+          <w:b/>
+          <w:bCs/>
+          <w:sz w:val="28"/>
+          <w:szCs w:val="28"/>
+        </w:rPr>
+        <w:t>formateringen</w:t>
+      </w:r>
+      <w:r>
+        <w:rPr>
+          <w:sz w:val="28"/>
+          <w:szCs w:val="28"/>
+        </w:rPr>
+        <w:t>.</w:t>
+      </w:r>
+      <w:r>
+        <w:rPr>
+          <w:rFonts w:ascii="Times New Roman" w:eastAsia="Times New Roman" w:hAnsi="Times New Roman" w:cs="Times New Roman"/>
+          <w:noProof w:val="0"/>
+          <w:kern w:val="0"/>
+          <w:sz w:val="24"/>
+          <w:szCs w:val="24"/>
+          <w:lang w:eastAsia="da-DK"/>
+          <w14:ligatures w14:val="none"/>
+        </w:rPr>
+        <w:t xml:space="preserve"> </w:t>
+      </w:r>
+    </w:p>
+    <w:p>
+      <w:pPr>
+        <w:pStyle w:val="Listeafsnit"/>
+        <w:numPr>
+          <w:ilvl w:val="0"/>
+          <w:numId w:val="11"/>
+        </w:numPr>
+        <w:spacing w:line="360" w:lineRule="auto"/>
+        <w:rPr>
+          <w:sz w:val="28"/>
+          <w:szCs w:val="28"/>
+        </w:rPr>
+      </w:pPr>
+      <w:r>
+        <w:rPr>
+          <w:sz w:val="28"/>
+          <w:szCs w:val="28"/>
+        </w:rPr>
+        <w:lastRenderedPageBreak/>
+        <w:t xml:space="preserve">Åbn </w:t>
+      </w:r>
+      <w:r>
+        <w:rPr>
+          <w:b/>
+          <w:bCs/>
+          <w:sz w:val="28"/>
+          <w:szCs w:val="28"/>
+        </w:rPr>
+        <w:t>TextEdit</w:t>
+      </w:r>
+      <w:r>
+        <w:rPr>
+          <w:sz w:val="28"/>
+          <w:szCs w:val="28"/>
+        </w:rPr>
+        <w:t xml:space="preserve"> (uden at åbne en fil).</w:t>
+      </w:r>
+    </w:p>
+    <w:p>
+      <w:pPr>
+        <w:numPr>
+          <w:ilvl w:val="0"/>
+          <w:numId w:val="11"/>
+        </w:numPr>
+        <w:spacing w:line="360" w:lineRule="auto"/>
+        <w:rPr>
+          <w:sz w:val="28"/>
+          <w:szCs w:val="28"/>
+        </w:rPr>
+      </w:pPr>
+      <w:r>
+        <w:rPr>
+          <w:sz w:val="28"/>
+          <w:szCs w:val="28"/>
+        </w:rPr>
+        <w:t xml:space="preserve">Gå til menulinjen og vælg </w:t>
+      </w:r>
+      <w:r>
+        <w:rPr>
+          <w:b/>
+          <w:bCs/>
+          <w:sz w:val="28"/>
+          <w:szCs w:val="28"/>
+        </w:rPr>
+        <w:t>TextEdit → Indstillinger</w:t>
+      </w:r>
+      <w:r>
+        <w:rPr>
+          <w:sz w:val="28"/>
+          <w:szCs w:val="28"/>
+        </w:rPr>
+        <w:t>.</w:t>
+      </w:r>
+    </w:p>
+    <w:p>
+      <w:pPr>
+        <w:numPr>
+          <w:ilvl w:val="0"/>
+          <w:numId w:val="11"/>
+        </w:numPr>
+        <w:spacing w:line="360" w:lineRule="auto"/>
+        <w:rPr>
+          <w:sz w:val="28"/>
+          <w:szCs w:val="28"/>
+        </w:rPr>
+      </w:pPr>
+      <w:r>
+        <w:rPr>
+          <w:sz w:val="28"/>
+          <w:szCs w:val="28"/>
+        </w:rPr>
+        <w:t xml:space="preserve">Under fanen </w:t>
+      </w:r>
+      <w:r>
+        <w:rPr>
+          <w:i/>
+          <w:iCs/>
+          <w:sz w:val="28"/>
+          <w:szCs w:val="28"/>
+        </w:rPr>
+        <w:t>Nyt dokument</w:t>
+      </w:r>
+      <w:r>
+        <w:rPr>
+          <w:sz w:val="28"/>
+          <w:szCs w:val="28"/>
+        </w:rPr>
+        <w:t xml:space="preserve"> vælg </w:t>
+      </w:r>
+      <w:r>
+        <w:rPr>
+          <w:b/>
+          <w:bCs/>
+          <w:sz w:val="28"/>
+          <w:szCs w:val="28"/>
+        </w:rPr>
+        <w:t>Format: Ren tekst</w:t>
+      </w:r>
+      <w:r>
+        <w:rPr>
+          <w:sz w:val="28"/>
+          <w:szCs w:val="28"/>
+        </w:rPr>
+        <w:t>.</w:t>
+      </w:r>
+    </w:p>
+    <w:p>
+      <w:pPr>
+        <w:spacing w:line="360" w:lineRule="auto"/>
+        <w:rPr>
+          <w:sz w:val="28"/>
+          <w:szCs w:val="28"/>
+        </w:rPr>
+      </w:pPr>
+      <w:r>
+        <w:rPr>
+          <w:sz w:val="28"/>
+          <w:szCs w:val="28"/>
+        </w:rPr>
+        <w:t xml:space="preserve">Indstillingen gemmes automatisk. Når du fremover åbner filer i </w:t>
+      </w:r>
+      <w:r>
+        <w:rPr>
+          <w:sz w:val="28"/>
+          <w:szCs w:val="28"/>
+        </w:rPr>
+        <w:t xml:space="preserve">TextEdit, </w:t>
+      </w:r>
+      <w:r>
+        <w:rPr>
+          <w:sz w:val="28"/>
+          <w:szCs w:val="28"/>
+        </w:rPr>
+        <w:t>vises de i ren tekst, så programmet fungerer korrekt til redigering af .yaml og .py-filer.</w:t>
+      </w:r>
+    </w:p>
+    <w:p>
+      <w:pPr>
+        <w:spacing w:line="360" w:lineRule="auto"/>
+        <w:rPr>
+          <w:sz w:val="28"/>
+          <w:szCs w:val="28"/>
+        </w:rPr>
+      </w:pPr>
+      <w:r>
+        <w:rPr>
+          <w:sz w:val="28"/>
+          <w:szCs w:val="28"/>
+        </w:rPr>
+        <w:t>For at åbne en fil i TextEdit</w:t>
+      </w:r>
+      <w:r>
+        <w:rPr>
+          <w:sz w:val="28"/>
+          <w:szCs w:val="28"/>
+        </w:rPr>
+        <w:t>, kan du</w:t>
+      </w:r>
+      <w:r>
+        <w:rPr>
+          <w:sz w:val="28"/>
+          <w:szCs w:val="28"/>
+        </w:rPr>
+        <w:t xml:space="preserve"> </w:t>
+      </w:r>
+      <w:r>
+        <w:rPr>
+          <w:sz w:val="28"/>
+          <w:szCs w:val="28"/>
+        </w:rPr>
+        <w:t>”</w:t>
+      </w:r>
+      <w:r>
+        <w:rPr>
+          <w:sz w:val="28"/>
+          <w:szCs w:val="28"/>
+        </w:rPr>
+        <w:t>træk</w:t>
+      </w:r>
+      <w:r>
+        <w:rPr>
+          <w:sz w:val="28"/>
+          <w:szCs w:val="28"/>
+        </w:rPr>
+        <w:t>ke og slippe”</w:t>
+      </w:r>
+      <w:r>
+        <w:rPr>
+          <w:sz w:val="28"/>
+          <w:szCs w:val="28"/>
+        </w:rPr>
+        <w:t xml:space="preserve"> filen ind i TextEdit</w:t>
+      </w:r>
+      <w:r>
+        <w:rPr>
+          <w:sz w:val="28"/>
+          <w:szCs w:val="28"/>
+        </w:rPr>
+        <w:t>:</w:t>
       </w:r>
     </w:p>
     <w:p>
@@ -2080,48 +2418,12 @@
       </w:pPr>
       <w:r>
         <w:rPr>
-          <w:sz w:val="28"/>
-          <w:szCs w:val="28"/>
-        </w:rPr>
-        <w:lastRenderedPageBreak/>
-        <w:t>Hvis du allerede har åbnet Terminal og navigeret til den rette mappe så gå til punkt 2</w:t>
-      </w:r>
-      <w:r>
-        <w:rPr>
-          <w:sz w:val="28"/>
-          <w:szCs w:val="28"/>
-        </w:rPr>
-        <w:t xml:space="preserve"> nedenfor</w:t>
-      </w:r>
-      <w:r>
-        <w:rPr>
-          <w:sz w:val="28"/>
-          <w:szCs w:val="28"/>
-        </w:rPr>
-        <w:t xml:space="preserve">. Ellers gentag punkt 2 til </w:t>
-      </w:r>
-      <w:r>
-        <w:rPr>
-          <w:sz w:val="28"/>
-          <w:szCs w:val="28"/>
-        </w:rPr>
-        <w:t>5</w:t>
-      </w:r>
-      <w:r>
-        <w:rPr>
-          <w:sz w:val="28"/>
-          <w:szCs w:val="28"/>
-        </w:rPr>
-        <w:t xml:space="preserve"> i afsnittet </w:t>
-      </w:r>
-      <w:r>
-        <w:rPr>
           <w:b/>
           <w:bCs/>
           <w:sz w:val="28"/>
           <w:szCs w:val="28"/>
         </w:rPr>
-        <w:t>Kørsel af programmet</w:t>
+        <w:t>Åbn TextEdit</w:t>
       </w:r>
       <w:r>
         <w:rPr>
@@ -2129,6 +2431,77 @@
           <w:szCs w:val="28"/>
         </w:rPr>
         <w:t>.</w:t>
+      </w:r>
+      <w:r>
+        <w:rPr>
+          <w:sz w:val="28"/>
+          <w:szCs w:val="28"/>
+        </w:rPr>
+        <w:t xml:space="preserve"> </w:t>
+      </w:r>
+      <w:r>
+        <w:rPr>
+          <w:sz w:val="28"/>
+          <w:szCs w:val="28"/>
+        </w:rPr>
+        <w:t>Logoet ser sådan ud:</w:t>
+      </w:r>
+      <w:r>
+        <w:rPr>
+          <w:sz w:val="28"/>
+          <w:szCs w:val="28"/>
+        </w:rPr>
+        <w:br/>
+      </w:r>
+      <w:r>
+        <w:drawing>
+          <wp:inline distT="0" distB="0" distL="0" distR="0" wp14:anchorId="384CE423" wp14:editId="27A8126A">
+            <wp:extent cx="1080000" cy="1080000"/>
+            <wp:effectExtent l="0" t="0" r="0" b="6350"/>
+            <wp:docPr id="363082527" name="Billede 10" descr="TextEdit | Apple Wiki | Fandom"/>
+            <wp:cNvGraphicFramePr>
+              <a:graphicFrameLocks xmlns:a="http://schemas.openxmlformats.org/drawingml/2006/main" noChangeAspect="1"/>
+            </wp:cNvGraphicFramePr>
+            <a:graphic xmlns:a="http://schemas.openxmlformats.org/drawingml/2006/main">
+              <a:graphicData uri="http://schemas.openxmlformats.org/drawingml/2006/picture">
+                <pic:pic xmlns:pic="http://schemas.openxmlformats.org/drawingml/2006/picture">
+                  <pic:nvPicPr>
+                    <pic:cNvPr id="0" name="Picture 3" descr="TextEdit | Apple Wiki | Fandom"/>
+                    <pic:cNvPicPr>
+                      <a:picLocks noChangeAspect="1" noChangeArrowheads="1"/>
+                    </pic:cNvPicPr>
+                  </pic:nvPicPr>
+                  <pic:blipFill>
+                    <a:blip r:embed="rId10" cstate="print">
+                      <a:extLst>
+                        <a:ext uri="{28A0092B-C50C-407E-A947-70E740481C1C}">
+                          <a14:useLocalDpi xmlns:a14="http://schemas.microsoft.com/office/drawing/2010/main" val="0"/>
+                        </a:ext>
+                      </a:extLst>
+                    </a:blip>
+                    <a:srcRect/>
+                    <a:stretch>
+                      <a:fillRect/>
+                    </a:stretch>
+                  </pic:blipFill>
+                  <pic:spPr bwMode="auto">
+                    <a:xfrm>
+                      <a:off x="0" y="0"/>
+                      <a:ext cx="1080000" cy="1080000"/>
+                    </a:xfrm>
+                    <a:prstGeom prst="rect">
+                      <a:avLst/>
+                    </a:prstGeom>
+                    <a:noFill/>
+                    <a:ln>
+                      <a:noFill/>
+                    </a:ln>
+                  </pic:spPr>
+                </pic:pic>
+              </a:graphicData>
+            </a:graphic>
+          </wp:inline>
+        </w:drawing>
       </w:r>
     </w:p>
     <w:p>
@@ -2149,6 +2522,194 @@
           <w:sz w:val="28"/>
           <w:szCs w:val="28"/>
         </w:rPr>
+        <w:t xml:space="preserve">Find </w:t>
+      </w:r>
+      <w:r>
+        <w:rPr>
+          <w:sz w:val="28"/>
+          <w:szCs w:val="28"/>
+        </w:rPr>
+        <w:t xml:space="preserve">den ønskede fil </w:t>
+      </w:r>
+      <w:r>
+        <w:rPr>
+          <w:sz w:val="28"/>
+          <w:szCs w:val="28"/>
+        </w:rPr>
+        <w:t xml:space="preserve">i </w:t>
+      </w:r>
+      <w:r>
+        <w:rPr>
+          <w:b/>
+          <w:bCs/>
+          <w:sz w:val="28"/>
+          <w:szCs w:val="28"/>
+        </w:rPr>
+        <w:t>Finder</w:t>
+      </w:r>
+      <w:r>
+        <w:rPr>
+          <w:sz w:val="28"/>
+          <w:szCs w:val="28"/>
+        </w:rPr>
+        <w:t>, f</w:t>
+      </w:r>
+      <w:r>
+        <w:rPr>
+          <w:sz w:val="28"/>
+          <w:szCs w:val="28"/>
+        </w:rPr>
+        <w:t>.eks.</w:t>
+      </w:r>
+      <w:r>
+        <w:rPr>
+          <w:sz w:val="28"/>
+          <w:szCs w:val="28"/>
+        </w:rPr>
+        <w:t xml:space="preserve"> params.yaml eller main.py.</w:t>
+      </w:r>
+    </w:p>
+    <w:p>
+      <w:pPr>
+        <w:pStyle w:val="Listeafsnit"/>
+        <w:numPr>
+          <w:ilvl w:val="0"/>
+          <w:numId w:val="8"/>
+        </w:numPr>
+        <w:spacing w:line="360" w:lineRule="auto"/>
+        <w:rPr>
+          <w:sz w:val="28"/>
+          <w:szCs w:val="28"/>
+        </w:rPr>
+      </w:pPr>
+      <w:r>
+        <w:rPr>
+          <w:sz w:val="28"/>
+          <w:szCs w:val="28"/>
+        </w:rPr>
+        <w:t>Træk filen fra Finder ind i det åbne TextEdit-vindue.</w:t>
+      </w:r>
+    </w:p>
+    <w:p>
+      <w:pPr>
+        <w:pStyle w:val="Listeafsnit"/>
+        <w:numPr>
+          <w:ilvl w:val="0"/>
+          <w:numId w:val="8"/>
+        </w:numPr>
+        <w:spacing w:line="360" w:lineRule="auto"/>
+        <w:rPr>
+          <w:sz w:val="28"/>
+          <w:szCs w:val="28"/>
+        </w:rPr>
+      </w:pPr>
+      <w:r>
+        <w:rPr>
+          <w:sz w:val="28"/>
+          <w:szCs w:val="28"/>
+        </w:rPr>
+        <w:t>Filen åbner nu i TextEdit, og du kan redigere indholdet direkte.</w:t>
+      </w:r>
+    </w:p>
+    <w:p>
+      <w:pPr>
+        <w:spacing w:line="360" w:lineRule="auto"/>
+        <w:rPr>
+          <w:sz w:val="28"/>
+          <w:szCs w:val="28"/>
+        </w:rPr>
+      </w:pPr>
+      <w:r>
+        <w:rPr>
+          <w:sz w:val="28"/>
+          <w:szCs w:val="28"/>
+        </w:rPr>
+        <w:t>Man kan også åbne en fil i TextEdit via Terminal:</w:t>
+      </w:r>
+    </w:p>
+    <w:p>
+      <w:pPr>
+        <w:pStyle w:val="Listeafsnit"/>
+        <w:numPr>
+          <w:ilvl w:val="0"/>
+          <w:numId w:val="10"/>
+        </w:numPr>
+        <w:spacing w:line="360" w:lineRule="auto"/>
+        <w:rPr>
+          <w:sz w:val="28"/>
+          <w:szCs w:val="28"/>
+        </w:rPr>
+      </w:pPr>
+      <w:r>
+        <w:rPr>
+          <w:sz w:val="28"/>
+          <w:szCs w:val="28"/>
+        </w:rPr>
+        <w:t>Hvis du allerede har åbnet Terminal og navigeret til den rette mappe så gå til punkt 2</w:t>
+      </w:r>
+      <w:r>
+        <w:rPr>
+          <w:sz w:val="28"/>
+          <w:szCs w:val="28"/>
+        </w:rPr>
+        <w:t xml:space="preserve"> nedenfor</w:t>
+      </w:r>
+      <w:r>
+        <w:rPr>
+          <w:sz w:val="28"/>
+          <w:szCs w:val="28"/>
+        </w:rPr>
+        <w:t xml:space="preserve">. Ellers gentag punkt 2 til </w:t>
+      </w:r>
+      <w:r>
+        <w:rPr>
+          <w:sz w:val="28"/>
+          <w:szCs w:val="28"/>
+        </w:rPr>
+        <w:t>6</w:t>
+      </w:r>
+      <w:r>
+        <w:rPr>
+          <w:sz w:val="28"/>
+          <w:szCs w:val="28"/>
+        </w:rPr>
+        <w:t xml:space="preserve"> i afsnittet </w:t>
+      </w:r>
+      <w:r>
+        <w:rPr>
+          <w:b/>
+          <w:bCs/>
+          <w:sz w:val="28"/>
+          <w:szCs w:val="28"/>
+        </w:rPr>
+        <w:t>Kørsel af programmet</w:t>
+      </w:r>
+      <w:r>
+        <w:rPr>
+          <w:sz w:val="28"/>
+          <w:szCs w:val="28"/>
+        </w:rPr>
+        <w:t>.</w:t>
+      </w:r>
+    </w:p>
+    <w:p>
+      <w:pPr>
+        <w:pStyle w:val="Listeafsnit"/>
+        <w:numPr>
+          <w:ilvl w:val="0"/>
+          <w:numId w:val="10"/>
+        </w:numPr>
+        <w:spacing w:line="360" w:lineRule="auto"/>
+        <w:rPr>
+          <w:sz w:val="28"/>
+          <w:szCs w:val="28"/>
+        </w:rPr>
+      </w:pPr>
+      <w:r>
+        <w:rPr>
+          <w:sz w:val="28"/>
+          <w:szCs w:val="28"/>
+        </w:rPr>
         <w:t xml:space="preserve">Åbn nu den ønskede fil i </w:t>
       </w:r>
       <w:r>
@@ -2287,9 +2848,23 @@
     </w:p>
     <w:p>
       <w:pPr>
+        <w:rPr>
+          <w:rFonts w:asciiTheme="majorHAnsi" w:eastAsiaTheme="majorEastAsia" w:hAnsiTheme="majorHAnsi" w:cstheme="majorBidi"/>
+          <w:color w:val="0F4761" w:themeColor="accent1" w:themeShade="BF"/>
+          <w:sz w:val="32"/>
+          <w:szCs w:val="32"/>
+        </w:rPr>
+      </w:pPr>
+      <w:r>
+        <w:br w:type="page"/>
+      </w:r>
+    </w:p>
+    <w:p>
+      <w:pPr>
         <w:pStyle w:val="Overskrift2"/>
       </w:pPr>
       <w:r>
+        <w:lastRenderedPageBreak/>
         <w:t>Standardin</w:t>
       </w:r>
       <w:r>
@@ -3238,6 +3813,7 @@
     </w:p>
     <w:p>
       <w:pPr>
+        <w:spacing w:line="360" w:lineRule="auto"/>
         <w:rPr>
           <w:b/>
           <w:bCs/>
@@ -3252,27 +3828,6 @@
           <w:sz w:val="28"/>
           <w:szCs w:val="28"/>
         </w:rPr>
-        <w:br w:type="page"/>
-      </w:r>
-    </w:p>
-    <w:p>
-      <w:pPr>
-        <w:spacing w:line="360" w:lineRule="auto"/>
-        <w:rPr>
-          <w:b/>
-          <w:bCs/>
-          <w:sz w:val="28"/>
-          <w:szCs w:val="28"/>
-        </w:rPr>
-      </w:pPr>
-      <w:r>
-        <w:rPr>
-          <w:b/>
-          <w:bCs/>
-          <w:sz w:val="28"/>
-          <w:szCs w:val="28"/>
-        </w:rPr>
-        <w:lastRenderedPageBreak/>
         <w:t>Standardopsætning men med variabel havdybde</w:t>
       </w:r>
     </w:p>
@@ -3294,9 +3849,9 @@
         <mc:AlternateContent>
           <mc:Choice Requires="wps">
             <w:drawing>
-              <wp:inline distT="0" distB="0" distL="0" distR="0" wp14:anchorId="22B7BECA" wp14:editId="7E1F1CC0">
-                <wp:extent cx="914400" cy="2089150"/>
-                <wp:effectExtent l="0" t="0" r="19050" b="25400"/>
+              <wp:inline distT="0" distB="0" distL="0" distR="0" wp14:anchorId="22B7BECA" wp14:editId="67E07570">
+                <wp:extent cx="914400" cy="1908000"/>
+                <wp:effectExtent l="0" t="0" r="22225" b="16510"/>
                 <wp:docPr id="1738998054" name="Tekstfelt 5"/>
                 <wp:cNvGraphicFramePr/>
                 <a:graphic xmlns:a="http://schemas.openxmlformats.org/drawingml/2006/main">
@@ -3306,7 +3861,7 @@
                       <wps:spPr>
                         <a:xfrm>
                           <a:off x="0" y="0"/>
-                          <a:ext cx="914400" cy="2089150"/>
+                          <a:ext cx="914400" cy="1908000"/>
                         </a:xfrm>
                         <a:prstGeom prst="rect">
                           <a:avLst/>
@@ -3486,9 +4041,10 @@
                             <w:pPr>
                               <w:spacing w:after="0"/>
                               <w:rPr>
-                                <w:sz w:val="24"/>
-                                <w:szCs w:val="24"/>
-                                <w:lang w:val="en-US"/>
+                                <w:i/>
+                                <w:iCs/>
+                                <w:sz w:val="24"/>
+                                <w:szCs w:val="24"/>
                               </w:rPr>
                             </w:pPr>
                             <w:r>
@@ -3498,25 +4054,6 @@
                                 <w:lang w:val="en-US"/>
                               </w:rPr>
                               <w:t>F: 4</w:t>
-                            </w:r>
-                          </w:p>
-                          <w:p>
-                            <w:pPr>
-                              <w:rPr>
-                                <w:i/>
-                                <w:iCs/>
-                                <w:sz w:val="24"/>
-                                <w:szCs w:val="24"/>
-                              </w:rPr>
-                            </w:pPr>
-                            <w:r>
-                              <w:rPr>
-                                <w:i/>
-                                <w:iCs/>
-                                <w:sz w:val="24"/>
-                                <w:szCs w:val="24"/>
-                              </w:rPr>
-                              <w:t>SD:</w:t>
                             </w:r>
                           </w:p>
                         </w:txbxContent>
@@ -3535,7 +4072,7 @@
           </mc:Choice>
           <mc:Fallback>
             <w:pict>
-              <v:shape w14:anchorId="22B7BECA" id="_x0000_s1028" type="#_x0000_t202" style="width:1in;height:164.5pt;visibility:visible;mso-wrap-style:none;mso-left-percent:-10001;mso-top-percent:-10001;mso-position-horizontal:absolute;mso-position-horizontal-relative:char;mso-position-vertical:absolute;mso-position-vertical-relative:line;mso-left-percent:-10001;mso-top-percent:-10001;v-text-anchor:top" o:gfxdata="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" fillcolor="#00b050" strokeweight=".5pt">
+              <v:shape w14:anchorId="22B7BECA" id="_x0000_s1028" type="#_x0000_t202" style="width:1in;height:150.25pt;visibility:visible;mso-wrap-style:none;mso-left-percent:-10001;mso-top-percent:-10001;mso-position-horizontal:absolute;mso-position-horizontal-relative:char;mso-position-vertical:absolute;mso-position-vertical-relative:line;mso-left-percent:-10001;mso-top-percent:-10001;v-text-anchor:top" o:gfxdata="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" fillcolor="#00b050" strokeweight=".5pt">
                 <v:textbox>
                   <w:txbxContent>
                     <w:p>
@@ -3702,9 +4239,10 @@
                       <w:pPr>
                         <w:spacing w:after="0"/>
                         <w:rPr>
-                          <w:sz w:val="24"/>
-                          <w:szCs w:val="24"/>
-                          <w:lang w:val="en-US"/>
+                          <w:i/>
+                          <w:iCs/>
+                          <w:sz w:val="24"/>
+                          <w:szCs w:val="24"/>
                         </w:rPr>
                       </w:pPr>
                       <w:r>
@@ -3714,25 +4252,6 @@
                           <w:lang w:val="en-US"/>
                         </w:rPr>
                         <w:t>F: 4</w:t>
-                      </w:r>
-                    </w:p>
-                    <w:p>
-                      <w:pPr>
-                        <w:rPr>
-                          <w:i/>
-                          <w:iCs/>
-                          <w:sz w:val="24"/>
-                          <w:szCs w:val="24"/>
-                        </w:rPr>
-                      </w:pPr>
-                      <w:r>
-                        <w:rPr>
-                          <w:i/>
-                          <w:iCs/>
-                          <w:sz w:val="24"/>
-                          <w:szCs w:val="24"/>
-                        </w:rPr>
-                        <w:t>SD:</w:t>
                       </w:r>
                     </w:p>
                   </w:txbxContent>
@@ -3760,9 +4279,9 @@
         <mc:AlternateContent>
           <mc:Choice Requires="wps">
             <w:drawing>
-              <wp:inline distT="0" distB="0" distL="0" distR="0" wp14:anchorId="0A9EFBFF" wp14:editId="10361E10">
-                <wp:extent cx="2480400" cy="2088000"/>
-                <wp:effectExtent l="0" t="0" r="23495" b="26670"/>
+              <wp:inline distT="0" distB="0" distL="0" distR="0" wp14:anchorId="0A9EFBFF" wp14:editId="7A53E3B5">
+                <wp:extent cx="2480400" cy="1908000"/>
+                <wp:effectExtent l="0" t="0" r="23495" b="16510"/>
                 <wp:docPr id="1022799706" name="Tekstfelt 5"/>
                 <wp:cNvGraphicFramePr/>
                 <a:graphic xmlns:a="http://schemas.openxmlformats.org/drawingml/2006/main">
@@ -3772,7 +4291,7 @@
                       <wps:spPr>
                         <a:xfrm>
                           <a:off x="0" y="0"/>
-                          <a:ext cx="2480400" cy="2088000"/>
+                          <a:ext cx="2480400" cy="1908000"/>
                         </a:xfrm>
                         <a:prstGeom prst="rect">
                           <a:avLst/>
@@ -3945,7 +4464,7 @@
           </mc:Choice>
           <mc:Fallback>
             <w:pict>
-              <v:shape w14:anchorId="0A9EFBFF" id="_x0000_s1029" type="#_x0000_t202" style="width:195.3pt;height:164.4pt;visibility:visible;mso-wrap-style:none;mso-left-percent:-10001;mso-top-percent:-10001;mso-position-horizontal:absolute;mso-position-horizontal-relative:char;mso-position-vertical:absolute;mso-position-vertical-relative:line;mso-left-percent:-10001;mso-top-percent:-10001;v-text-anchor:top" o:gfxdata="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" fillcolor="#00b0f0" strokeweight=".5pt">
+              <v:shape w14:anchorId="0A9EFBFF" id="_x0000_s1029" type="#_x0000_t202" style="width:195.3pt;height:150.25pt;visibility:visible;mso-wrap-style:none;mso-left-percent:-10001;mso-top-percent:-10001;mso-position-horizontal:absolute;mso-position-horizontal-relative:char;mso-position-vertical:absolute;mso-position-vertical-relative:line;mso-left-percent:-10001;mso-top-percent:-10001;v-text-anchor:top" o:gfxdata="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" fillcolor="#00b0f0" strokeweight=".5pt">
                 <v:textbox>
                   <w:txbxContent>
                     <w:p>
@@ -4100,7 +4619,6 @@
     </w:p>
     <w:p>
       <w:pPr>
-        <w:spacing w:after="0" w:line="360" w:lineRule="auto"/>
         <w:rPr>
           <w:b/>
           <w:bCs/>
@@ -4115,6 +4633,27 @@
           <w:sz w:val="28"/>
           <w:szCs w:val="28"/>
         </w:rPr>
+        <w:br w:type="page"/>
+      </w:r>
+    </w:p>
+    <w:p>
+      <w:pPr>
+        <w:spacing w:after="0" w:line="360" w:lineRule="auto"/>
+        <w:rPr>
+          <w:b/>
+          <w:bCs/>
+          <w:sz w:val="28"/>
+          <w:szCs w:val="28"/>
+        </w:rPr>
+      </w:pPr>
+      <w:r>
+        <w:rPr>
+          <w:b/>
+          <w:bCs/>
+          <w:sz w:val="28"/>
+          <w:szCs w:val="28"/>
+        </w:rPr>
+        <w:lastRenderedPageBreak/>
         <w:t>Eksempel på opsætning til kørsel med årstidsvariation</w:t>
       </w:r>
     </w:p>
@@ -6219,6 +6758,19 @@
             </w:pict>
           </mc:Fallback>
         </mc:AlternateContent>
+      </w:r>
+    </w:p>
+    <w:p>
+      <w:pPr>
+        <w:rPr>
+          <w:rFonts w:asciiTheme="majorHAnsi" w:eastAsiaTheme="majorEastAsia" w:hAnsiTheme="majorHAnsi" w:cstheme="majorBidi"/>
+          <w:color w:val="0F4761" w:themeColor="accent1" w:themeShade="BF"/>
+          <w:sz w:val="32"/>
+          <w:szCs w:val="32"/>
+        </w:rPr>
+      </w:pPr>
+      <w:r>
+        <w:br w:type="page"/>
       </w:r>
     </w:p>
     <w:p>
@@ -6773,6 +7325,21 @@
               <w:t xml:space="preserve"> meter havdybde (m)</w:t>
             </w:r>
           </w:p>
+          <w:p>
+            <w:pPr>
+              <w:rPr>
+                <w:sz w:val="28"/>
+                <w:szCs w:val="28"/>
+              </w:rPr>
+            </w:pPr>
+            <w:r>
+              <w:rPr>
+                <w:sz w:val="28"/>
+                <w:szCs w:val="28"/>
+              </w:rPr>
+              <w:t>(Overskrives i havdybdetilstand)</w:t>
+            </w:r>
+          </w:p>
         </w:tc>
       </w:tr>
     </w:tbl>
@@ -6833,7 +7400,21 @@
                 <w:sz w:val="28"/>
                 <w:szCs w:val="28"/>
               </w:rPr>
-              <w:t>Antal år der skal simuleres</w:t>
+              <w:t>Antal år</w:t>
+            </w:r>
+            <w:r>
+              <w:rPr>
+                <w:sz w:val="28"/>
+                <w:szCs w:val="28"/>
+              </w:rPr>
+              <w:t>,</w:t>
+            </w:r>
+            <w:r>
+              <w:rPr>
+                <w:sz w:val="28"/>
+                <w:szCs w:val="28"/>
+              </w:rPr>
+              <w:t xml:space="preserve"> der skal simuleres</w:t>
             </w:r>
           </w:p>
         </w:tc>
@@ -6962,7 +7543,35 @@
                 <w:sz w:val="28"/>
                 <w:szCs w:val="28"/>
               </w:rPr>
-              <w:t xml:space="preserve">Tilstande for kørslen. Skal være en liste (enten [mode1,mode2, tec. ] eller - tekst1 </w:t>
+              <w:t>Tilstande for kørslen. Skal være en liste (enten [mode1,</w:t>
+            </w:r>
+            <w:r>
+              <w:rPr>
+                <w:sz w:val="28"/>
+                <w:szCs w:val="28"/>
+              </w:rPr>
+              <w:t xml:space="preserve"> </w:t>
+            </w:r>
+            <w:r>
+              <w:rPr>
+                <w:sz w:val="28"/>
+                <w:szCs w:val="28"/>
+              </w:rPr>
+              <w:t xml:space="preserve">mode2, </w:t>
+            </w:r>
+            <w:r>
+              <w:rPr>
+                <w:sz w:val="28"/>
+                <w:szCs w:val="28"/>
+              </w:rPr>
+              <w:t>et</w:t>
+            </w:r>
+            <w:r>
+              <w:rPr>
+                <w:sz w:val="28"/>
+                <w:szCs w:val="28"/>
+              </w:rPr>
+              <w:t xml:space="preserve">c.] eller - tekst1 </w:t>
             </w:r>
             <w:r>
               <w:rPr>
@@ -7024,6 +7633,21 @@
               <w:t>Hvor mange år der skal simuleres uden ekstra strålingspåvirkning</w:t>
             </w:r>
           </w:p>
+          <w:p>
+            <w:pPr>
+              <w:rPr>
+                <w:sz w:val="28"/>
+                <w:szCs w:val="28"/>
+              </w:rPr>
+            </w:pPr>
+            <w:r>
+              <w:rPr>
+                <w:sz w:val="28"/>
+                <w:szCs w:val="28"/>
+              </w:rPr>
+              <w:t>Er den tom, anvendes years/2</w:t>
+            </w:r>
+          </w:p>
         </w:tc>
       </w:tr>
     </w:tbl>
@@ -7037,7 +7661,8 @@
       </w:pPr>
     </w:p>
     <w:sectPr>
-      <w:headerReference w:type="default" r:id="rId10"/>
+      <w:headerReference w:type="default" r:id="rId11"/>
+      <w:footerReference w:type="default" r:id="rId12"/>
       <w:pgSz w:w="11906" w:h="16838"/>
       <w:pgMar w:top="1701" w:right="1134" w:bottom="1701" w:left="1134" w:header="708" w:footer="708" w:gutter="0"/>
       <w:cols w:space="708"/>
@@ -7070,6 +7695,54 @@
     </w:p>
   </w:endnote>
 </w:endnotes>
+</file>
+
+<file path=word/footer1.xml><?xml version="1.0" encoding="utf-8"?>
+<w:ftr xmlns:wpc="http://schemas.microsoft.com/office/word/2010/wordprocessingCanvas" xmlns:cx="http://schemas.microsoft.com/office/drawing/2014/chartex" xmlns:cx1="http://schemas.microsoft.com/office/drawing/2015/9/8/chartex" xmlns:cx2="http://schemas.microsoft.com/office/drawing/2015/10/21/chartex" xmlns:cx3="http://schemas.microsoft.com/office/drawing/2016/5/9/chartex" xmlns:cx4="http://schemas.microsoft.com/office/drawing/2016/5/10/chartex" xmlns:cx5="http://schemas.microsoft.com/office/drawing/2016/5/11/chartex" xmlns:cx6="http://schemas.microsoft.com/office/drawing/2016/5/12/chartex" xmlns:cx7="http://schemas.microsoft.com/office/drawing/2016/5/13/chartex" xmlns:cx8="http://schemas.microsoft.com/office/drawing/2016/5/14/chartex" xmlns:mc="http://schemas.openxmlformats.org/markup-compatibility/2006" xmlns:aink="http://schemas.microsoft.com/office/drawing/2016/ink" xmlns:am3d="http://schemas.microsoft.com/office/drawing/2017/model3d" xmlns:o="urn:schemas-microsoft-com:office:office" xmlns:oel="http://schemas.microsoft.com/office/2019/extlst" xmlns:r="http://schemas.openxmlformats.org/officeDocument/2006/relationships" xmlns:m="http://schemas.openxmlformats.org/officeDocument/2006/math" xmlns:v="urn:schemas-microsoft-com:vml" xmlns:wp14="http://schemas.microsoft.com/office/word/2010/wordprocessingDrawing" xmlns:wp="http://schemas.openxmlformats.org/drawingml/2006/wordprocessingDrawing" xmlns:w10="urn:schemas-microsoft-com:office:word" xmlns:w="http://schemas.openxmlformats.org/wordprocessingml/2006/main" xmlns:w14="http://schemas.microsoft.com/office/word/2010/wordml" xmlns:w15="http://schemas.microsoft.com/office/word/2012/wordml" xmlns:w16cex="http://schemas.microsoft.com/office/word/2018/wordml/cex" xmlns:w16cid="http://schemas.microsoft.com/office/word/2016/wordml/cid" xmlns:w16="http://schemas.microsoft.com/office/word/2018/wordml" xmlns:w16du="http://schemas.microsoft.com/office/word/2023/wordml/word16du" xmlns:w16sdtdh="http://schemas.microsoft.com/office/word/2020/wordml/sdtdatahash" xmlns:w16sdtfl="http://schemas.microsoft.com/office/word/2024/wordml/sdtformatlock" xmlns:w16se="http://schemas.microsoft.com/office/word/2015/wordml/symex" xmlns:wpg="http://schemas.microsoft.com/office/word/2010/wordprocessingGroup" xmlns:wpi="http://schemas.microsoft.com/office/word/2010/wordprocessingInk" xmlns:wne="http://schemas.microsoft.com/office/word/2006/wordml" xmlns:wps="http://schemas.microsoft.com/office/word/2010/wordprocessingShape" mc:Ignorable="w14 w15 w16se w16cid w16 w16cex w16sdtdh w16sdtfl w16du wp14">
+  <w:sdt>
+    <w:sdtPr>
+      <w:id w:val="-1347093584"/>
+      <w:docPartObj>
+        <w:docPartGallery w:val="Page Numbers (Bottom of Page)"/>
+        <w:docPartUnique/>
+      </w:docPartObj>
+    </w:sdtPr>
+    <w:sdtContent>
+      <w:p>
+        <w:pPr>
+          <w:pStyle w:val="Sidefod"/>
+          <w:jc w:val="right"/>
+        </w:pPr>
+        <w:r>
+          <w:fldChar w:fldCharType="begin"/>
+        </w:r>
+        <w:r>
+          <w:instrText>PAGE   \* MERGEFORMAT</w:instrText>
+        </w:r>
+        <w:r>
+          <w:fldChar w:fldCharType="separate"/>
+        </w:r>
+        <w:r>
+          <w:t>2</w:t>
+        </w:r>
+        <w:r>
+          <w:fldChar w:fldCharType="end"/>
+        </w:r>
+        <w:r>
+          <w:t>/</w:t>
+        </w:r>
+        <w:r>
+          <w:t>7</w:t>
+        </w:r>
+      </w:p>
+    </w:sdtContent>
+  </w:sdt>
+  <w:p>
+    <w:pPr>
+      <w:pStyle w:val="Sidefod"/>
+    </w:pPr>
+  </w:p>
+</w:ftr>
 </file>
 
 <file path=word/footnotes.xml><?xml version="1.0" encoding="utf-8"?>
@@ -7832,6 +8505,232 @@
     </w:lvl>
   </w:abstractNum>
   <w:abstractNum w:abstractNumId="6" w15:restartNumberingAfterBreak="0">
+    <w:nsid w:val="4788775E"/>
+    <w:multiLevelType w:val="multilevel"/>
+    <w:tmpl w:val="4A02C2C4"/>
+    <w:lvl w:ilvl="0">
+      <w:start w:val="1"/>
+      <w:numFmt w:val="decimal"/>
+      <w:lvlText w:val="%1."/>
+      <w:lvlJc w:val="left"/>
+      <w:pPr>
+        <w:tabs>
+          <w:tab w:val="num" w:pos="720"/>
+        </w:tabs>
+        <w:ind w:left="720" w:hanging="360"/>
+      </w:pPr>
+    </w:lvl>
+    <w:lvl w:ilvl="1" w:tentative="1">
+      <w:start w:val="1"/>
+      <w:numFmt w:val="decimal"/>
+      <w:lvlText w:val="%2."/>
+      <w:lvlJc w:val="left"/>
+      <w:pPr>
+        <w:tabs>
+          <w:tab w:val="num" w:pos="1440"/>
+        </w:tabs>
+        <w:ind w:left="1440" w:hanging="360"/>
+      </w:pPr>
+    </w:lvl>
+    <w:lvl w:ilvl="2" w:tentative="1">
+      <w:start w:val="1"/>
+      <w:numFmt w:val="decimal"/>
+      <w:lvlText w:val="%3."/>
+      <w:lvlJc w:val="left"/>
+      <w:pPr>
+        <w:tabs>
+          <w:tab w:val="num" w:pos="2160"/>
+        </w:tabs>
+        <w:ind w:left="2160" w:hanging="360"/>
+      </w:pPr>
+    </w:lvl>
+    <w:lvl w:ilvl="3" w:tentative="1">
+      <w:start w:val="1"/>
+      <w:numFmt w:val="decimal"/>
+      <w:lvlText w:val="%4."/>
+      <w:lvlJc w:val="left"/>
+      <w:pPr>
+        <w:tabs>
+          <w:tab w:val="num" w:pos="2880"/>
+        </w:tabs>
+        <w:ind w:left="2880" w:hanging="360"/>
+      </w:pPr>
+    </w:lvl>
+    <w:lvl w:ilvl="4" w:tentative="1">
+      <w:start w:val="1"/>
+      <w:numFmt w:val="decimal"/>
+      <w:lvlText w:val="%5."/>
+      <w:lvlJc w:val="left"/>
+      <w:pPr>
+        <w:tabs>
+          <w:tab w:val="num" w:pos="3600"/>
+        </w:tabs>
+        <w:ind w:left="3600" w:hanging="360"/>
+      </w:pPr>
+    </w:lvl>
+    <w:lvl w:ilvl="5" w:tentative="1">
+      <w:start w:val="1"/>
+      <w:numFmt w:val="decimal"/>
+      <w:lvlText w:val="%6."/>
+      <w:lvlJc w:val="left"/>
+      <w:pPr>
+        <w:tabs>
+          <w:tab w:val="num" w:pos="4320"/>
+        </w:tabs>
+        <w:ind w:left="4320" w:hanging="360"/>
+      </w:pPr>
+    </w:lvl>
+    <w:lvl w:ilvl="6" w:tentative="1">
+      <w:start w:val="1"/>
+      <w:numFmt w:val="decimal"/>
+      <w:lvlText w:val="%7."/>
+      <w:lvlJc w:val="left"/>
+      <w:pPr>
+        <w:tabs>
+          <w:tab w:val="num" w:pos="5040"/>
+        </w:tabs>
+        <w:ind w:left="5040" w:hanging="360"/>
+      </w:pPr>
+    </w:lvl>
+    <w:lvl w:ilvl="7" w:tentative="1">
+      <w:start w:val="1"/>
+      <w:numFmt w:val="decimal"/>
+      <w:lvlText w:val="%8."/>
+      <w:lvlJc w:val="left"/>
+      <w:pPr>
+        <w:tabs>
+          <w:tab w:val="num" w:pos="5760"/>
+        </w:tabs>
+        <w:ind w:left="5760" w:hanging="360"/>
+      </w:pPr>
+    </w:lvl>
+    <w:lvl w:ilvl="8" w:tentative="1">
+      <w:start w:val="1"/>
+      <w:numFmt w:val="decimal"/>
+      <w:lvlText w:val="%9."/>
+      <w:lvlJc w:val="left"/>
+      <w:pPr>
+        <w:tabs>
+          <w:tab w:val="num" w:pos="6480"/>
+        </w:tabs>
+        <w:ind w:left="6480" w:hanging="360"/>
+      </w:pPr>
+    </w:lvl>
+  </w:abstractNum>
+  <w:abstractNum w:abstractNumId="7" w15:restartNumberingAfterBreak="0">
+    <w:nsid w:val="4CF64AD7"/>
+    <w:multiLevelType w:val="multilevel"/>
+    <w:tmpl w:val="DFF8C4F4"/>
+    <w:lvl w:ilvl="0">
+      <w:start w:val="1"/>
+      <w:numFmt w:val="decimal"/>
+      <w:lvlText w:val="%1."/>
+      <w:lvlJc w:val="left"/>
+      <w:pPr>
+        <w:tabs>
+          <w:tab w:val="num" w:pos="720"/>
+        </w:tabs>
+        <w:ind w:left="720" w:hanging="360"/>
+      </w:pPr>
+    </w:lvl>
+    <w:lvl w:ilvl="1" w:tentative="1">
+      <w:start w:val="1"/>
+      <w:numFmt w:val="decimal"/>
+      <w:lvlText w:val="%2."/>
+      <w:lvlJc w:val="left"/>
+      <w:pPr>
+        <w:tabs>
+          <w:tab w:val="num" w:pos="1440"/>
+        </w:tabs>
+        <w:ind w:left="1440" w:hanging="360"/>
+      </w:pPr>
+    </w:lvl>
+    <w:lvl w:ilvl="2" w:tentative="1">
+      <w:start w:val="1"/>
+      <w:numFmt w:val="decimal"/>
+      <w:lvlText w:val="%3."/>
+      <w:lvlJc w:val="left"/>
+      <w:pPr>
+        <w:tabs>
+          <w:tab w:val="num" w:pos="2160"/>
+        </w:tabs>
+        <w:ind w:left="2160" w:hanging="360"/>
+      </w:pPr>
+    </w:lvl>
+    <w:lvl w:ilvl="3" w:tentative="1">
+      <w:start w:val="1"/>
+      <w:numFmt w:val="decimal"/>
+      <w:lvlText w:val="%4."/>
+      <w:lvlJc w:val="left"/>
+      <w:pPr>
+        <w:tabs>
+          <w:tab w:val="num" w:pos="2880"/>
+        </w:tabs>
+        <w:ind w:left="2880" w:hanging="360"/>
+      </w:pPr>
+    </w:lvl>
+    <w:lvl w:ilvl="4" w:tentative="1">
+      <w:start w:val="1"/>
+      <w:numFmt w:val="decimal"/>
+      <w:lvlText w:val="%5."/>
+      <w:lvlJc w:val="left"/>
+      <w:pPr>
+        <w:tabs>
+          <w:tab w:val="num" w:pos="3600"/>
+        </w:tabs>
+        <w:ind w:left="3600" w:hanging="360"/>
+      </w:pPr>
+    </w:lvl>
+    <w:lvl w:ilvl="5" w:tentative="1">
+      <w:start w:val="1"/>
+      <w:numFmt w:val="decimal"/>
+      <w:lvlText w:val="%6."/>
+      <w:lvlJc w:val="left"/>
+      <w:pPr>
+        <w:tabs>
+          <w:tab w:val="num" w:pos="4320"/>
+        </w:tabs>
+        <w:ind w:left="4320" w:hanging="360"/>
+      </w:pPr>
+    </w:lvl>
+    <w:lvl w:ilvl="6" w:tentative="1">
+      <w:start w:val="1"/>
+      <w:numFmt w:val="decimal"/>
+      <w:lvlText w:val="%7."/>
+      <w:lvlJc w:val="left"/>
+      <w:pPr>
+        <w:tabs>
+          <w:tab w:val="num" w:pos="5040"/>
+        </w:tabs>
+        <w:ind w:left="5040" w:hanging="360"/>
+      </w:pPr>
+    </w:lvl>
+    <w:lvl w:ilvl="7" w:tentative="1">
+      <w:start w:val="1"/>
+      <w:numFmt w:val="decimal"/>
+      <w:lvlText w:val="%8."/>
+      <w:lvlJc w:val="left"/>
+      <w:pPr>
+        <w:tabs>
+          <w:tab w:val="num" w:pos="5760"/>
+        </w:tabs>
+        <w:ind w:left="5760" w:hanging="360"/>
+      </w:pPr>
+    </w:lvl>
+    <w:lvl w:ilvl="8" w:tentative="1">
+      <w:start w:val="1"/>
+      <w:numFmt w:val="decimal"/>
+      <w:lvlText w:val="%9."/>
+      <w:lvlJc w:val="left"/>
+      <w:pPr>
+        <w:tabs>
+          <w:tab w:val="num" w:pos="6480"/>
+        </w:tabs>
+        <w:ind w:left="6480" w:hanging="360"/>
+      </w:pPr>
+    </w:lvl>
+  </w:abstractNum>
+  <w:abstractNum w:abstractNumId="8" w15:restartNumberingAfterBreak="0">
     <w:nsid w:val="5470205E"/>
     <w:multiLevelType w:val="hybridMultilevel"/>
     <w:tmpl w:val="D2046A24"/>
@@ -7922,7 +8821,96 @@
       </w:pPr>
     </w:lvl>
   </w:abstractNum>
-  <w:abstractNum w:abstractNumId="7" w15:restartNumberingAfterBreak="0">
+  <w:abstractNum w:abstractNumId="9" w15:restartNumberingAfterBreak="0">
+    <w:nsid w:val="5AC91798"/>
+    <w:multiLevelType w:val="hybridMultilevel"/>
+    <w:tmpl w:val="29A632BA"/>
+    <w:lvl w:ilvl="0" w:tplc="0406000F">
+      <w:start w:val="1"/>
+      <w:numFmt w:val="decimal"/>
+      <w:lvlText w:val="%1."/>
+      <w:lvlJc w:val="left"/>
+      <w:pPr>
+        <w:ind w:left="720" w:hanging="360"/>
+      </w:pPr>
+      <w:rPr>
+        <w:rFonts w:hint="default"/>
+      </w:rPr>
+    </w:lvl>
+    <w:lvl w:ilvl="1" w:tplc="04060019" w:tentative="1">
+      <w:start w:val="1"/>
+      <w:numFmt w:val="lowerLetter"/>
+      <w:lvlText w:val="%2."/>
+      <w:lvlJc w:val="left"/>
+      <w:pPr>
+        <w:ind w:left="1440" w:hanging="360"/>
+      </w:pPr>
+    </w:lvl>
+    <w:lvl w:ilvl="2" w:tplc="0406001B" w:tentative="1">
+      <w:start w:val="1"/>
+      <w:numFmt w:val="lowerRoman"/>
+      <w:lvlText w:val="%3."/>
+      <w:lvlJc w:val="right"/>
+      <w:pPr>
+        <w:ind w:left="2160" w:hanging="180"/>
+      </w:pPr>
+    </w:lvl>
+    <w:lvl w:ilvl="3" w:tplc="0406000F" w:tentative="1">
+      <w:start w:val="1"/>
+      <w:numFmt w:val="decimal"/>
+      <w:lvlText w:val="%4."/>
+      <w:lvlJc w:val="left"/>
+      <w:pPr>
+        <w:ind w:left="2880" w:hanging="360"/>
+      </w:pPr>
+    </w:lvl>
+    <w:lvl w:ilvl="4" w:tplc="04060019" w:tentative="1">
+      <w:start w:val="1"/>
+      <w:numFmt w:val="lowerLetter"/>
+      <w:lvlText w:val="%5."/>
+      <w:lvlJc w:val="left"/>
+      <w:pPr>
+        <w:ind w:left="3600" w:hanging="360"/>
+      </w:pPr>
+    </w:lvl>
+    <w:lvl w:ilvl="5" w:tplc="0406001B" w:tentative="1">
+      <w:start w:val="1"/>
+      <w:numFmt w:val="lowerRoman"/>
+      <w:lvlText w:val="%6."/>
+      <w:lvlJc w:val="right"/>
+      <w:pPr>
+        <w:ind w:left="4320" w:hanging="180"/>
+      </w:pPr>
+    </w:lvl>
+    <w:lvl w:ilvl="6" w:tplc="0406000F" w:tentative="1">
+      <w:start w:val="1"/>
+      <w:numFmt w:val="decimal"/>
+      <w:lvlText w:val="%7."/>
+      <w:lvlJc w:val="left"/>
+      <w:pPr>
+        <w:ind w:left="5040" w:hanging="360"/>
+      </w:pPr>
+    </w:lvl>
+    <w:lvl w:ilvl="7" w:tplc="04060019" w:tentative="1">
+      <w:start w:val="1"/>
+      <w:numFmt w:val="lowerLetter"/>
+      <w:lvlText w:val="%8."/>
+      <w:lvlJc w:val="left"/>
+      <w:pPr>
+        <w:ind w:left="5760" w:hanging="360"/>
+      </w:pPr>
+    </w:lvl>
+    <w:lvl w:ilvl="8" w:tplc="0406001B" w:tentative="1">
+      <w:start w:val="1"/>
+      <w:numFmt w:val="lowerRoman"/>
+      <w:lvlText w:val="%9."/>
+      <w:lvlJc w:val="right"/>
+      <w:pPr>
+        <w:ind w:left="6480" w:hanging="180"/>
+      </w:pPr>
+    </w:lvl>
+  </w:abstractNum>
+  <w:abstractNum w:abstractNumId="10" w15:restartNumberingAfterBreak="0">
     <w:nsid w:val="5FDD7975"/>
     <w:multiLevelType w:val="hybridMultilevel"/>
     <w:tmpl w:val="5394DEE8"/>
@@ -8027,12 +9015,21 @@
     <w:abstractNumId w:val="5"/>
   </w:num>
   <w:num w:numId="6" w16cid:durableId="1973628530">
-    <w:abstractNumId w:val="6"/>
+    <w:abstractNumId w:val="8"/>
   </w:num>
   <w:num w:numId="7" w16cid:durableId="893001540">
     <w:abstractNumId w:val="0"/>
   </w:num>
   <w:num w:numId="8" w16cid:durableId="443500345">
+    <w:abstractNumId w:val="10"/>
+  </w:num>
+  <w:num w:numId="9" w16cid:durableId="901451505">
+    <w:abstractNumId w:val="6"/>
+  </w:num>
+  <w:num w:numId="10" w16cid:durableId="752429525">
+    <w:abstractNumId w:val="9"/>
+  </w:num>
+  <w:num w:numId="11" w16cid:durableId="550724563">
     <w:abstractNumId w:val="7"/>
   </w:num>
 </w:numbering>
@@ -8642,7 +9639,6 @@
   <w:style w:type="character" w:default="1" w:styleId="Standardskrifttypeiafsnit">
     <w:name w:val="Default Paragraph Font"/>
     <w:uiPriority w:val="1"/>
-    <w:semiHidden/>
     <w:unhideWhenUsed/>
   </w:style>
   <w:style w:type="table" w:default="1" w:styleId="Tabel-Normal">
@@ -9071,6 +10067,19 @@
       <w:noProof/>
     </w:rPr>
   </w:style>
+  <w:style w:type="paragraph" w:styleId="NormalWeb">
+    <w:name w:val="Normal (Web)"/>
+    <w:basedOn w:val="Normal"/>
+    <w:uiPriority w:val="99"/>
+    <w:semiHidden/>
+    <w:unhideWhenUsed/>
+    <w:rsid w:val="009F0164"/>
+    <w:rPr>
+      <w:rFonts w:ascii="Times New Roman" w:hAnsi="Times New Roman" w:cs="Times New Roman"/>
+      <w:sz w:val="24"/>
+      <w:szCs w:val="24"/>
+    </w:rPr>
+  </w:style>
 </w:styles>
 </file>
 

</xml_diff>